<commit_message>
Updated Test strategy with boundry value condition tables.
</commit_message>
<xml_diff>
--- a/Test_Strategy_Financial_Data_Processing_App.docx
+++ b/Test_Strategy_Financial_Data_Processing_App.docx
@@ -302,6 +302,12 @@
       <w:r>
         <w:t>Validate input files (InstrumentDetails.csv, PositionDetails.csv) for file format, schema, data types, mandatory fields, null values, duplicate records, referential integrity, and numeric range validations.</w:t>
       </w:r>
+      <w:r>
+        <w:t xml:space="preserve"> </w:t>
+      </w:r>
+      <w:r>
+        <w:t>Additional schema/data-quality checks include required headers, column count, data types, formats, unexpected or missing columns, whitespace/normalization, and unusable reference data.</w:t>
+      </w:r>
     </w:p>
     <w:p>
       <w:pPr>
@@ -477,6 +483,7 @@
         <w:spacing w:after="60"/>
       </w:pPr>
       <w:r>
+        <w:lastRenderedPageBreak/>
         <w:t>Input files</w:t>
       </w:r>
       <w:r>
@@ -493,7 +500,6 @@
         <w:spacing w:after="60"/>
       </w:pPr>
       <w:r>
-        <w:lastRenderedPageBreak/>
         <w:t>Rounding policy for Total Price calculations defaults to Half-Up precision (2 decimal places) unless specified by external configuration.</w:t>
       </w:r>
     </w:p>
@@ -507,10 +513,20 @@
         <w:spacing w:after="60"/>
       </w:pPr>
       <w:r>
-        <w:t>Required API endpoints and UI are available during test execution</w:t>
-      </w:r>
-      <w:r>
-        <w:t>.</w:t>
+        <w:t>Boundary conditions, accepted formats, precision/rounding, and rejection behaviour should be reviewed and confirmed against the agreed business/domain rules before final implementation.</w:t>
+      </w:r>
+    </w:p>
+    <w:p>
+      <w:pPr>
+        <w:pStyle w:val="ListParagraph"/>
+        <w:numPr>
+          <w:ilvl w:val="0"/>
+          <w:numId w:val="1"/>
+        </w:numPr>
+        <w:spacing w:after="60"/>
+      </w:pPr>
+      <w:r>
+        <w:t>Required API endpoints and UI are available during test execution.</w:t>
       </w:r>
     </w:p>
     <w:p>
@@ -1598,7 +1614,11 @@
           </w:tcPr>
           <w:p>
             <w:r>
-              <w:t>Validate successful and negative POST payload scenarios, including status code, ID, timestamp, and response payload.</w:t>
+              <w:t xml:space="preserve">Validate successful and negative POST payload scenarios, including status </w:t>
+            </w:r>
+            <w:r>
+              <w:lastRenderedPageBreak/>
+              <w:t>code, ID, timestamp, and response payload.</w:t>
             </w:r>
           </w:p>
         </w:tc>
@@ -1609,6 +1629,7 @@
           </w:tcPr>
           <w:p>
             <w:r>
+              <w:lastRenderedPageBreak/>
               <w:t>API Functional</w:t>
             </w:r>
           </w:p>
@@ -1620,7 +1641,11 @@
           </w:tcPr>
           <w:p>
             <w:r>
-              <w:t>Validate status code, response payload, ID, timestamp, and negative payload handling.</w:t>
+              <w:t xml:space="preserve">Validate status code, response payload, ID, </w:t>
+            </w:r>
+            <w:r>
+              <w:lastRenderedPageBreak/>
+              <w:t>timestamp, and negative payload handling.</w:t>
             </w:r>
           </w:p>
         </w:tc>
@@ -1633,6 +1658,7 @@
           </w:tcPr>
           <w:p>
             <w:r>
+              <w:lastRenderedPageBreak/>
               <w:t>REQ-UI-01</w:t>
             </w:r>
           </w:p>
@@ -1655,11 +1681,7 @@
           </w:tcPr>
           <w:p>
             <w:r>
-              <w:t xml:space="preserve">Verification of homepage endpoint </w:t>
-            </w:r>
-            <w:r>
-              <w:lastRenderedPageBreak/>
-              <w:t>views and payload display</w:t>
+              <w:t>Verification of homepage endpoint views and payload display</w:t>
             </w:r>
           </w:p>
         </w:tc>
@@ -1670,7 +1692,6 @@
           </w:tcPr>
           <w:p>
             <w:r>
-              <w:lastRenderedPageBreak/>
               <w:t>Web UI</w:t>
             </w:r>
           </w:p>
@@ -1682,11 +1703,7 @@
           </w:tcPr>
           <w:p>
             <w:r>
-              <w:t xml:space="preserve">Selenium POM element </w:t>
-            </w:r>
-            <w:r>
-              <w:lastRenderedPageBreak/>
-              <w:t>presence and text checks.</w:t>
+              <w:t>Selenium POM element presence and text checks.</w:t>
             </w:r>
           </w:p>
         </w:tc>
@@ -1699,7 +1716,6 @@
           </w:tcPr>
           <w:p>
             <w:r>
-              <w:lastRenderedPageBreak/>
               <w:t>REQ-UI-02</w:t>
             </w:r>
           </w:p>
@@ -1757,12 +1773,363 @@
     </w:p>
     <w:p>
       <w:pPr>
+        <w:pStyle w:val="Heading2"/>
+        <w:spacing w:before="240" w:after="120"/>
+      </w:pPr>
+      <w:r>
+        <w:t>5</w:t>
+      </w:r>
+      <w:r>
+        <w:t xml:space="preserve">.1 </w:t>
+      </w:r>
+      <w:r>
+        <w:t>Boundary Value Analysis</w:t>
+      </w:r>
+    </w:p>
+    <w:p>
+      <w:pPr>
         <w:spacing w:after="120"/>
         <w:rPr>
+          <w:iCs/>
+        </w:rPr>
+      </w:pPr>
+      <w:r>
+        <w:rPr>
+          <w:iCs/>
+        </w:rPr>
+        <w:t>Boundary cases are derived from business rules or the agreed data contract. For Quantity &gt; 0 and Unit Price &gt; 0, test values immediately below the boundary, at the boundary, and immediately above it.</w:t>
+      </w:r>
+    </w:p>
+    <w:p>
+      <w:pPr>
+        <w:spacing w:after="120"/>
+        <w:rPr>
+          <w:iCs/>
+        </w:rPr>
+      </w:pPr>
+    </w:p>
+    <w:tbl>
+      <w:tblPr>
+        <w:tblW w:w="10100" w:type="dxa"/>
+        <w:tblBorders>
+          <w:top w:val="single" w:sz="4" w:space="0" w:color="auto"/>
+          <w:left w:val="single" w:sz="4" w:space="0" w:color="auto"/>
+          <w:bottom w:val="single" w:sz="4" w:space="0" w:color="auto"/>
+          <w:right w:val="single" w:sz="4" w:space="0" w:color="auto"/>
+          <w:insideH w:val="single" w:sz="4" w:space="0" w:color="auto"/>
+          <w:insideV w:val="single" w:sz="4" w:space="0" w:color="auto"/>
+        </w:tblBorders>
+        <w:tblCellMar>
+          <w:left w:w="10" w:type="dxa"/>
+          <w:right w:w="10" w:type="dxa"/>
+        </w:tblCellMar>
+        <w:tblLook w:val="0000" w:firstRow="0" w:lastRow="0" w:firstColumn="0" w:lastColumn="0" w:noHBand="0" w:noVBand="0"/>
+      </w:tblPr>
+      <w:tblGrid>
+        <w:gridCol w:w="2124"/>
+        <w:gridCol w:w="1877"/>
+        <w:gridCol w:w="4217"/>
+        <w:gridCol w:w="1882"/>
+      </w:tblGrid>
+      <w:tr>
+        <w:trPr>
+          <w:tblHeader/>
+        </w:trPr>
+        <w:tc>
+          <w:tcPr>
+            <w:tcW w:w="2124" w:type="dxa"/>
+            <w:shd w:val="clear" w:color="auto" w:fill="1F4E78"/>
+          </w:tcPr>
+          <w:p>
+            <w:pPr>
+              <w:rPr>
+                <w:b/>
+                <w:bCs/>
+                <w:color w:val="FFFFFF"/>
+              </w:rPr>
+            </w:pPr>
+            <w:r>
+              <w:rPr>
+                <w:b/>
+                <w:bCs/>
+                <w:color w:val="FFFFFF"/>
+              </w:rPr>
+              <w:t>Business Rule</w:t>
+            </w:r>
+          </w:p>
+        </w:tc>
+        <w:tc>
+          <w:tcPr>
+            <w:tcW w:w="1877" w:type="dxa"/>
+            <w:shd w:val="clear" w:color="auto" w:fill="1F4E78"/>
+          </w:tcPr>
+          <w:p>
+            <w:pPr>
+              <w:rPr>
+                <w:b/>
+                <w:bCs/>
+                <w:color w:val="FFFFFF"/>
+              </w:rPr>
+            </w:pPr>
+            <w:r>
+              <w:rPr>
+                <w:b/>
+                <w:bCs/>
+                <w:color w:val="FFFFFF"/>
+              </w:rPr>
+              <w:t>Boundary / Negative</w:t>
+            </w:r>
+          </w:p>
+        </w:tc>
+        <w:tc>
+          <w:tcPr>
+            <w:tcW w:w="4217" w:type="dxa"/>
+            <w:shd w:val="clear" w:color="auto" w:fill="1F4E78"/>
+          </w:tcPr>
+          <w:p>
+            <w:pPr>
+              <w:rPr>
+                <w:b/>
+                <w:bCs/>
+                <w:color w:val="FFFFFF"/>
+              </w:rPr>
+            </w:pPr>
+            <w:r>
+              <w:rPr>
+                <w:b/>
+                <w:bCs/>
+                <w:color w:val="FFFFFF"/>
+              </w:rPr>
+              <w:t>Boundary / Valid</w:t>
+            </w:r>
+          </w:p>
+        </w:tc>
+        <w:tc>
+          <w:tcPr>
+            <w:tcW w:w="1882" w:type="dxa"/>
+            <w:shd w:val="clear" w:color="auto" w:fill="1F4E78"/>
+          </w:tcPr>
+          <w:p>
+            <w:pPr>
+              <w:rPr>
+                <w:b/>
+                <w:bCs/>
+                <w:color w:val="FFFFFF"/>
+              </w:rPr>
+            </w:pPr>
+            <w:r>
+              <w:rPr>
+                <w:b/>
+                <w:bCs/>
+                <w:color w:val="FFFFFF"/>
+              </w:rPr>
+              <w:t>Expected</w:t>
+            </w:r>
+          </w:p>
+        </w:tc>
+      </w:tr>
+      <w:tr>
+        <w:tc>
+          <w:tcPr>
+            <w:tcW w:w="2124" w:type="dxa"/>
+          </w:tcPr>
+          <w:p>
+            <w:r>
+              <w:t>Quantity &gt; 0</w:t>
+            </w:r>
+          </w:p>
+        </w:tc>
+        <w:tc>
+          <w:tcPr>
+            <w:tcW w:w="1877" w:type="dxa"/>
+          </w:tcPr>
+          <w:p>
+            <w:r>
+              <w:t>-1 / 0</w:t>
+            </w:r>
+          </w:p>
+        </w:tc>
+        <w:tc>
+          <w:tcPr>
+            <w:tcW w:w="4217" w:type="dxa"/>
+          </w:tcPr>
+          <w:p>
+            <w:r>
+              <w:t>1</w:t>
+            </w:r>
+          </w:p>
+        </w:tc>
+        <w:tc>
+          <w:tcPr>
+            <w:tcW w:w="1882" w:type="dxa"/>
+          </w:tcPr>
+          <w:p>
+            <w:r>
+              <w:t>Reject -1 and 0; accept 1</w:t>
+            </w:r>
+          </w:p>
+        </w:tc>
+      </w:tr>
+      <w:tr>
+        <w:tc>
+          <w:tcPr>
+            <w:tcW w:w="2124" w:type="dxa"/>
+          </w:tcPr>
+          <w:p>
+            <w:r>
+              <w:t>Unit Price &gt; 0</w:t>
+            </w:r>
+          </w:p>
+        </w:tc>
+        <w:tc>
+          <w:tcPr>
+            <w:tcW w:w="1877" w:type="dxa"/>
+          </w:tcPr>
+          <w:p>
+            <w:r>
+              <w:t>-0.01 / 0.00</w:t>
+            </w:r>
+          </w:p>
+        </w:tc>
+        <w:tc>
+          <w:tcPr>
+            <w:tcW w:w="4217" w:type="dxa"/>
+          </w:tcPr>
+          <w:p>
+            <w:r>
+              <w:t>0.01</w:t>
+            </w:r>
+          </w:p>
+        </w:tc>
+        <w:tc>
+          <w:tcPr>
+            <w:tcW w:w="1882" w:type="dxa"/>
+          </w:tcPr>
+          <w:p>
+            <w:r>
+              <w:t>Reject non-positive; accept positive</w:t>
+            </w:r>
+          </w:p>
+        </w:tc>
+      </w:tr>
+      <w:tr>
+        <w:tc>
+          <w:tcPr>
+            <w:tcW w:w="2124" w:type="dxa"/>
+          </w:tcPr>
+          <w:p>
+            <w:r>
+              <w:t>2 decimal places*</w:t>
+            </w:r>
+          </w:p>
+        </w:tc>
+        <w:tc>
+          <w:tcPr>
+            <w:tcW w:w="1877" w:type="dxa"/>
+          </w:tcPr>
+          <w:p>
+            <w:r>
+              <w:t>100.001</w:t>
+            </w:r>
+          </w:p>
+        </w:tc>
+        <w:tc>
+          <w:tcPr>
+            <w:tcW w:w="4217" w:type="dxa"/>
+          </w:tcPr>
+          <w:p>
+            <w:r>
+              <w:t>100.00 / 100.01</w:t>
+            </w:r>
+          </w:p>
+        </w:tc>
+        <w:tc>
+          <w:tcPr>
+            <w:tcW w:w="1882" w:type="dxa"/>
+          </w:tcPr>
+          <w:p>
+            <w:r>
+              <w:t>Reject or round according to agreed rule</w:t>
+            </w:r>
+          </w:p>
+        </w:tc>
+      </w:tr>
+      <w:tr>
+        <w:tc>
+          <w:tcPr>
+            <w:tcW w:w="2124" w:type="dxa"/>
+          </w:tcPr>
+          <w:p>
+            <w:r>
+              <w:t>Reference integrity</w:t>
+            </w:r>
+          </w:p>
+        </w:tc>
+        <w:tc>
+          <w:tcPr>
+            <w:tcW w:w="1877" w:type="dxa"/>
+          </w:tcPr>
+          <w:p>
+            <w:r>
+              <w:t xml:space="preserve">Unknown </w:t>
+            </w:r>
+            <w:proofErr w:type="spellStart"/>
+            <w:r>
+              <w:t>InstrumentID</w:t>
+            </w:r>
+            <w:proofErr w:type="spellEnd"/>
+          </w:p>
+        </w:tc>
+        <w:tc>
+          <w:tcPr>
+            <w:tcW w:w="4217" w:type="dxa"/>
+          </w:tcPr>
+          <w:p>
+            <w:r>
+              <w:t xml:space="preserve">Existing </w:t>
+            </w:r>
+            <w:proofErr w:type="spellStart"/>
+            <w:r>
+              <w:t>InstrumentID</w:t>
+            </w:r>
+            <w:proofErr w:type="spellEnd"/>
+          </w:p>
+        </w:tc>
+        <w:tc>
+          <w:tcPr>
+            <w:tcW w:w="1882" w:type="dxa"/>
+          </w:tcPr>
+          <w:p>
+            <w:r>
+              <w:t>Reject unmatched reference</w:t>
+            </w:r>
+          </w:p>
+        </w:tc>
+      </w:tr>
+    </w:tbl>
+    <w:p/>
+    <w:p>
+      <w:r>
+        <w:t xml:space="preserve">* </w:t>
+      </w:r>
+      <w:r>
+        <w:rPr>
           <w:i/>
-          <w:iCs/>
-        </w:rPr>
-      </w:pPr>
+        </w:rPr>
+        <w:t xml:space="preserve">Precision/rounding </w:t>
+      </w:r>
+      <w:r>
+        <w:rPr>
+          <w:i/>
+        </w:rPr>
+        <w:t>behaviour</w:t>
+      </w:r>
+      <w:r>
+        <w:rPr>
+          <w:i/>
+        </w:rPr>
+        <w:t xml:space="preserve"> must be confirmed with the business/domain owner. The current strategy states Half-Up to 2 decimal places by default unless externally configured.</w:t>
+      </w:r>
     </w:p>
     <w:p>
       <w:pPr>
@@ -1797,6 +2164,14 @@
     <w:p>
       <w:pPr>
         <w:pStyle w:val="NormalWeb"/>
+        <w:numPr>
+          <w:ilvl w:val="0"/>
+          <w:numId w:val="5"/>
+        </w:numPr>
+        <w:rPr>
+          <w:sz w:val="20"/>
+          <w:szCs w:val="20"/>
+        </w:rPr>
       </w:pPr>
       <w:r>
         <w:rPr>
@@ -1834,6 +2209,26 @@
           <w:szCs w:val="20"/>
         </w:rPr>
         <w:t xml:space="preserve"> using the defined transformation rules.</w:t>
+      </w:r>
+    </w:p>
+    <w:p>
+      <w:pPr>
+        <w:pStyle w:val="NormalWeb"/>
+        <w:numPr>
+          <w:ilvl w:val="0"/>
+          <w:numId w:val="5"/>
+        </w:numPr>
+      </w:pPr>
+      <w:r>
+        <w:t xml:space="preserve">Include boundary values and negative data such as malformed files, missing columns, empty files, invalid numeric values, duplicate keys, unmatched </w:t>
+      </w:r>
+      <w:proofErr w:type="spellStart"/>
+      <w:r>
+        <w:t>InstrumentID</w:t>
+      </w:r>
+      <w:proofErr w:type="spellEnd"/>
+      <w:r>
+        <w:t xml:space="preserve"> values, and other agreed invalid cases.</w:t>
       </w:r>
     </w:p>
     <w:p>
@@ -2120,8 +2515,6 @@
             <w:r>
               <w:t>.</w:t>
             </w:r>
-            <w:bookmarkStart w:id="0" w:name="_GoBack"/>
-            <w:bookmarkEnd w:id="0"/>
           </w:p>
         </w:tc>
       </w:tr>
@@ -2179,6 +2572,7 @@
           <w:sz w:val="20"/>
           <w:szCs w:val="20"/>
         </w:rPr>
+        <w:lastRenderedPageBreak/>
         <w:t>Data Layer: Check reconciliation reports for data, calculation, or transformation issues.</w:t>
       </w:r>
     </w:p>
@@ -2231,6 +2625,31 @@
     <w:p>
       <w:pPr>
         <w:pStyle w:val="Heading1"/>
+        <w:numPr>
+          <w:ilvl w:val="0"/>
+          <w:numId w:val="4"/>
+        </w:numPr>
+        <w:spacing w:before="240" w:after="120"/>
+        <w:rPr>
+          <w:color w:val="auto"/>
+          <w:sz w:val="20"/>
+          <w:szCs w:val="20"/>
+        </w:rPr>
+      </w:pPr>
+      <w:r>
+        <w:rPr>
+          <w:color w:val="auto"/>
+          <w:sz w:val="20"/>
+          <w:szCs w:val="20"/>
+        </w:rPr>
+        <w:t>Defect Management: Follow Detect → Reproduce → Log → Triage → Assign → Fix → Retest → Regression → Close. Defects should capture the affected layer/module, environment/build, steps, expected and actual results, severity, priority, evidence, logs, linked test, owner, and status. Severity represents impact; priority represents urgency.</w:t>
+      </w:r>
+      <w:bookmarkStart w:id="0" w:name="_GoBack"/>
+      <w:bookmarkEnd w:id="0"/>
+    </w:p>
+    <w:p>
+      <w:pPr>
+        <w:pStyle w:val="Heading1"/>
         <w:spacing w:before="240" w:after="120"/>
         <w:rPr>
           <w:color w:val="auto"/>
@@ -2411,7 +2830,6 @@
         <w:spacing w:before="240" w:after="120"/>
       </w:pPr>
       <w:r>
-        <w:lastRenderedPageBreak/>
         <w:t>8</w:t>
       </w:r>
       <w:r>
@@ -2727,6 +3145,7 @@
         <w:spacing w:before="240" w:after="120"/>
       </w:pPr>
       <w:r>
+        <w:lastRenderedPageBreak/>
         <w:t>10</w:t>
       </w:r>
       <w:r>
@@ -3146,9 +3565,9 @@
     </w:lvl>
   </w:abstractNum>
   <w:abstractNum w:abstractNumId="1">
-    <w:nsid w:val="664B2B1F"/>
+    <w:nsid w:val="47375005"/>
     <w:multiLevelType w:val="hybridMultilevel"/>
-    <w:tmpl w:val="F5E8694C"/>
+    <w:tmpl w:val="16E808C4"/>
     <w:lvl w:ilvl="0" w:tplc="40090001">
       <w:start w:val="1"/>
       <w:numFmt w:val="bullet"/>
@@ -3259,6 +3678,119 @@
     </w:lvl>
   </w:abstractNum>
   <w:abstractNum w:abstractNumId="2">
+    <w:nsid w:val="664B2B1F"/>
+    <w:multiLevelType w:val="hybridMultilevel"/>
+    <w:tmpl w:val="F5E8694C"/>
+    <w:lvl w:ilvl="0" w:tplc="40090001">
+      <w:start w:val="1"/>
+      <w:numFmt w:val="bullet"/>
+      <w:lvlText w:val=""/>
+      <w:lvlJc w:val="left"/>
+      <w:pPr>
+        <w:ind w:left="720" w:hanging="360"/>
+      </w:pPr>
+      <w:rPr>
+        <w:rFonts w:ascii="Symbol" w:hAnsi="Symbol" w:hint="default"/>
+      </w:rPr>
+    </w:lvl>
+    <w:lvl w:ilvl="1" w:tplc="40090003" w:tentative="1">
+      <w:start w:val="1"/>
+      <w:numFmt w:val="bullet"/>
+      <w:lvlText w:val="o"/>
+      <w:lvlJc w:val="left"/>
+      <w:pPr>
+        <w:ind w:left="1440" w:hanging="360"/>
+      </w:pPr>
+      <w:rPr>
+        <w:rFonts w:ascii="Courier New" w:hAnsi="Courier New" w:cs="Courier New" w:hint="default"/>
+      </w:rPr>
+    </w:lvl>
+    <w:lvl w:ilvl="2" w:tplc="40090005" w:tentative="1">
+      <w:start w:val="1"/>
+      <w:numFmt w:val="bullet"/>
+      <w:lvlText w:val=""/>
+      <w:lvlJc w:val="left"/>
+      <w:pPr>
+        <w:ind w:left="2160" w:hanging="360"/>
+      </w:pPr>
+      <w:rPr>
+        <w:rFonts w:ascii="Wingdings" w:hAnsi="Wingdings" w:hint="default"/>
+      </w:rPr>
+    </w:lvl>
+    <w:lvl w:ilvl="3" w:tplc="40090001" w:tentative="1">
+      <w:start w:val="1"/>
+      <w:numFmt w:val="bullet"/>
+      <w:lvlText w:val=""/>
+      <w:lvlJc w:val="left"/>
+      <w:pPr>
+        <w:ind w:left="2880" w:hanging="360"/>
+      </w:pPr>
+      <w:rPr>
+        <w:rFonts w:ascii="Symbol" w:hAnsi="Symbol" w:hint="default"/>
+      </w:rPr>
+    </w:lvl>
+    <w:lvl w:ilvl="4" w:tplc="40090003" w:tentative="1">
+      <w:start w:val="1"/>
+      <w:numFmt w:val="bullet"/>
+      <w:lvlText w:val="o"/>
+      <w:lvlJc w:val="left"/>
+      <w:pPr>
+        <w:ind w:left="3600" w:hanging="360"/>
+      </w:pPr>
+      <w:rPr>
+        <w:rFonts w:ascii="Courier New" w:hAnsi="Courier New" w:cs="Courier New" w:hint="default"/>
+      </w:rPr>
+    </w:lvl>
+    <w:lvl w:ilvl="5" w:tplc="40090005" w:tentative="1">
+      <w:start w:val="1"/>
+      <w:numFmt w:val="bullet"/>
+      <w:lvlText w:val=""/>
+      <w:lvlJc w:val="left"/>
+      <w:pPr>
+        <w:ind w:left="4320" w:hanging="360"/>
+      </w:pPr>
+      <w:rPr>
+        <w:rFonts w:ascii="Wingdings" w:hAnsi="Wingdings" w:hint="default"/>
+      </w:rPr>
+    </w:lvl>
+    <w:lvl w:ilvl="6" w:tplc="40090001" w:tentative="1">
+      <w:start w:val="1"/>
+      <w:numFmt w:val="bullet"/>
+      <w:lvlText w:val=""/>
+      <w:lvlJc w:val="left"/>
+      <w:pPr>
+        <w:ind w:left="5040" w:hanging="360"/>
+      </w:pPr>
+      <w:rPr>
+        <w:rFonts w:ascii="Symbol" w:hAnsi="Symbol" w:hint="default"/>
+      </w:rPr>
+    </w:lvl>
+    <w:lvl w:ilvl="7" w:tplc="40090003" w:tentative="1">
+      <w:start w:val="1"/>
+      <w:numFmt w:val="bullet"/>
+      <w:lvlText w:val="o"/>
+      <w:lvlJc w:val="left"/>
+      <w:pPr>
+        <w:ind w:left="5760" w:hanging="360"/>
+      </w:pPr>
+      <w:rPr>
+        <w:rFonts w:ascii="Courier New" w:hAnsi="Courier New" w:cs="Courier New" w:hint="default"/>
+      </w:rPr>
+    </w:lvl>
+    <w:lvl w:ilvl="8" w:tplc="40090005" w:tentative="1">
+      <w:start w:val="1"/>
+      <w:numFmt w:val="bullet"/>
+      <w:lvlText w:val=""/>
+      <w:lvlJc w:val="left"/>
+      <w:pPr>
+        <w:ind w:left="6480" w:hanging="360"/>
+      </w:pPr>
+      <w:rPr>
+        <w:rFonts w:ascii="Wingdings" w:hAnsi="Wingdings" w:hint="default"/>
+      </w:rPr>
+    </w:lvl>
+  </w:abstractNum>
+  <w:abstractNum w:abstractNumId="3">
     <w:nsid w:val="6DFE7226"/>
     <w:multiLevelType w:val="multilevel"/>
     <w:tmpl w:val="E11C7154"/>
@@ -3371,7 +3903,7 @@
       </w:pPr>
     </w:lvl>
   </w:abstractNum>
-  <w:abstractNum w:abstractNumId="3">
+  <w:abstractNum w:abstractNumId="4">
     <w:nsid w:val="6F1E29C5"/>
     <w:multiLevelType w:val="hybridMultilevel"/>
     <w:tmpl w:val="2C96C8A6"/>
@@ -3491,12 +4023,15 @@
     </w:lvlOverride>
   </w:num>
   <w:num w:numId="2">
+    <w:abstractNumId w:val="4"/>
+  </w:num>
+  <w:num w:numId="3">
     <w:abstractNumId w:val="3"/>
   </w:num>
-  <w:num w:numId="3">
+  <w:num w:numId="4">
     <w:abstractNumId w:val="2"/>
   </w:num>
-  <w:num w:numId="4">
+  <w:num w:numId="5">
     <w:abstractNumId w:val="1"/>
   </w:num>
 </w:numbering>

</xml_diff>